<commit_message>
Update Matriz de Trazabilidad
Se intercambió uno de los módulos por otro
</commit_message>
<xml_diff>
--- a/Documentacion/Matriz de Trazabilidad.docx
+++ b/Documentacion/Matriz de Trazabilidad.docx
@@ -70,13 +70,23 @@
                 <w:szCs w:val="22"/>
               </w:rPr>
             </w:pPr>
-            <w:r>
-              <w:rPr>
-                <w:rFonts w:ascii="Arial" w:hAnsi="Arial" w:cs="Arial"/>
-                <w:sz w:val="22"/>
-                <w:szCs w:val="22"/>
-              </w:rPr>
-              <w:t>Req.</w:t>
+            <w:proofErr w:type="spellStart"/>
+            <w:r>
+              <w:rPr>
+                <w:rFonts w:ascii="Arial" w:hAnsi="Arial" w:cs="Arial"/>
+                <w:sz w:val="22"/>
+                <w:szCs w:val="22"/>
+              </w:rPr>
+              <w:t>Req</w:t>
+            </w:r>
+            <w:proofErr w:type="spellEnd"/>
+            <w:r>
+              <w:rPr>
+                <w:rFonts w:ascii="Arial" w:hAnsi="Arial" w:cs="Arial"/>
+                <w:sz w:val="22"/>
+                <w:szCs w:val="22"/>
+              </w:rPr>
+              <w:t>.</w:t>
             </w:r>
           </w:p>
         </w:tc>
@@ -311,7 +321,43 @@
                 <w:sz w:val="22"/>
                 <w:szCs w:val="22"/>
               </w:rPr>
-              <w:t>Definir la entidad ubicaciones y sus atributos obligatorios desde la interfaz: id_ubicacion (PK), nombre, direccion, ciudad y capacidad.</w:t>
+              <w:t xml:space="preserve">Definir la entidad ubicaciones y sus atributos obligatorios desde la interfaz: </w:t>
+            </w:r>
+            <w:proofErr w:type="spellStart"/>
+            <w:r>
+              <w:rPr>
+                <w:rFonts w:ascii="Arial" w:hAnsi="Arial" w:cs="Arial"/>
+                <w:sz w:val="22"/>
+                <w:szCs w:val="22"/>
+              </w:rPr>
+              <w:t>id_ubicacion</w:t>
+            </w:r>
+            <w:proofErr w:type="spellEnd"/>
+            <w:r>
+              <w:rPr>
+                <w:rFonts w:ascii="Arial" w:hAnsi="Arial" w:cs="Arial"/>
+                <w:sz w:val="22"/>
+                <w:szCs w:val="22"/>
+              </w:rPr>
+              <w:t xml:space="preserve"> (PK), nombre, </w:t>
+            </w:r>
+            <w:proofErr w:type="spellStart"/>
+            <w:r>
+              <w:rPr>
+                <w:rFonts w:ascii="Arial" w:hAnsi="Arial" w:cs="Arial"/>
+                <w:sz w:val="22"/>
+                <w:szCs w:val="22"/>
+              </w:rPr>
+              <w:t>direccion</w:t>
+            </w:r>
+            <w:proofErr w:type="spellEnd"/>
+            <w:r>
+              <w:rPr>
+                <w:rFonts w:ascii="Arial" w:hAnsi="Arial" w:cs="Arial"/>
+                <w:sz w:val="22"/>
+                <w:szCs w:val="22"/>
+              </w:rPr>
+              <w:t>, ciudad y capacidad.</w:t>
             </w:r>
           </w:p>
         </w:tc>
@@ -871,7 +917,25 @@
                 <w:sz w:val="22"/>
                 <w:szCs w:val="22"/>
               </w:rPr>
-              <w:t>Establecer la relación de cardinalidad entre la entidad Eventos y la entidad ubicaciones mediante la clave foránea id_ubicacion.</w:t>
+              <w:t xml:space="preserve">Establecer la relación de cardinalidad entre la entidad Eventos y la entidad ubicaciones mediante la clave foránea </w:t>
+            </w:r>
+            <w:proofErr w:type="spellStart"/>
+            <w:r>
+              <w:rPr>
+                <w:rFonts w:ascii="Arial" w:hAnsi="Arial" w:cs="Arial"/>
+                <w:sz w:val="22"/>
+                <w:szCs w:val="22"/>
+              </w:rPr>
+              <w:t>id_ubicacion</w:t>
+            </w:r>
+            <w:proofErr w:type="spellEnd"/>
+            <w:r>
+              <w:rPr>
+                <w:rFonts w:ascii="Arial" w:hAnsi="Arial" w:cs="Arial"/>
+                <w:sz w:val="22"/>
+                <w:szCs w:val="22"/>
+              </w:rPr>
+              <w:t>.</w:t>
             </w:r>
           </w:p>
         </w:tc>
@@ -1004,7 +1068,25 @@
                 <w:sz w:val="22"/>
                 <w:szCs w:val="22"/>
               </w:rPr>
-              <w:t>Incorporar el atributo id_ubicacion como Clave Foránea (FK) en el esquema relacional de eventos para estructurar consultas complejas.</w:t>
+              <w:t xml:space="preserve">Incorporar el atributo </w:t>
+            </w:r>
+            <w:proofErr w:type="spellStart"/>
+            <w:r>
+              <w:rPr>
+                <w:rFonts w:ascii="Arial" w:hAnsi="Arial" w:cs="Arial"/>
+                <w:sz w:val="22"/>
+                <w:szCs w:val="22"/>
+              </w:rPr>
+              <w:t>id_ubicacion</w:t>
+            </w:r>
+            <w:proofErr w:type="spellEnd"/>
+            <w:r>
+              <w:rPr>
+                <w:rFonts w:ascii="Arial" w:hAnsi="Arial" w:cs="Arial"/>
+                <w:sz w:val="22"/>
+                <w:szCs w:val="22"/>
+              </w:rPr>
+              <w:t xml:space="preserve"> como Clave Foránea (FK) en el esquema relacional de eventos para estructurar consultas complejas.</w:t>
             </w:r>
           </w:p>
         </w:tc>
@@ -1634,8 +1716,6 @@
       <w:pPr>
         <w:rPr>
           <w:rFonts w:ascii="Arial" w:hAnsi="Arial" w:cs="Arial"/>
-          <w:b/>
-          <w:bCs/>
           <w:sz w:val="22"/>
           <w:szCs w:val="22"/>
         </w:rPr>
@@ -1649,51 +1729,29 @@
           <w:szCs w:val="22"/>
         </w:rPr>
         <w:lastRenderedPageBreak/>
-        <w:t>Módulo de Disponibilidad de Usuarios y Gestión de Tiempos</w:t>
+        <w:t>Módulo de Eventos Recurrentes</w:t>
       </w:r>
     </w:p>
     <w:tbl>
       <w:tblPr>
-        <w:tblW w:w="5000" w:type="pct"/>
-        <w:tblCellMar>
-          <w:top w:w="15" w:type="dxa"/>
-          <w:left w:w="15" w:type="dxa"/>
-          <w:bottom w:w="15" w:type="dxa"/>
-          <w:right w:w="15" w:type="dxa"/>
-        </w:tblCellMar>
+        <w:tblStyle w:val="Tablaconcuadrcula"/>
+        <w:tblW w:w="0" w:type="auto"/>
         <w:tblLook w:val="04A0" w:firstRow="1" w:lastRow="0" w:firstColumn="1" w:lastColumn="0" w:noHBand="0" w:noVBand="1"/>
       </w:tblPr>
       <w:tblGrid>
-        <w:gridCol w:w="825"/>
-        <w:gridCol w:w="1715"/>
-        <w:gridCol w:w="5249"/>
-        <w:gridCol w:w="1555"/>
+        <w:gridCol w:w="846"/>
+        <w:gridCol w:w="1843"/>
+        <w:gridCol w:w="5103"/>
+        <w:gridCol w:w="1558"/>
       </w:tblGrid>
       <w:tr>
-        <w:trPr>
-          <w:trHeight w:val="20"/>
-        </w:trPr>
-        <w:tc>
-          <w:tcPr>
-            <w:tcW w:w="441" w:type="pct"/>
-            <w:tcBorders>
-              <w:top w:val="single" w:sz="6" w:space="0" w:color="C4C7C5"/>
-              <w:left w:val="single" w:sz="6" w:space="0" w:color="C4C7C5"/>
-              <w:bottom w:val="single" w:sz="6" w:space="0" w:color="C4C7C5"/>
-              <w:right w:val="single" w:sz="6" w:space="0" w:color="C4C7C5"/>
-            </w:tcBorders>
-            <w:tcMar>
-              <w:top w:w="120" w:type="dxa"/>
-              <w:left w:w="180" w:type="dxa"/>
-              <w:bottom w:w="120" w:type="dxa"/>
-              <w:right w:w="180" w:type="dxa"/>
-            </w:tcMar>
-            <w:vAlign w:val="center"/>
-            <w:hideMark/>
-          </w:tcPr>
-          <w:p>
-            <w:pPr>
-              <w:spacing w:after="0" w:line="240" w:lineRule="auto"/>
+        <w:tc>
+          <w:tcPr>
+            <w:tcW w:w="846" w:type="dxa"/>
+            <w:vAlign w:val="center"/>
+          </w:tcPr>
+          <w:p>
+            <w:pPr>
               <w:jc w:val="center"/>
               <w:rPr>
                 <w:rFonts w:ascii="Arial" w:hAnsi="Arial" w:cs="Arial"/>
@@ -1701,37 +1759,35 @@
                 <w:szCs w:val="22"/>
               </w:rPr>
             </w:pPr>
-            <w:r>
-              <w:rPr>
-                <w:rFonts w:ascii="Arial" w:hAnsi="Arial" w:cs="Arial"/>
-                <w:sz w:val="22"/>
-                <w:szCs w:val="22"/>
-              </w:rPr>
-              <w:t>Req.</w:t>
-            </w:r>
-          </w:p>
-        </w:tc>
-        <w:tc>
-          <w:tcPr>
-            <w:tcW w:w="918" w:type="pct"/>
-            <w:tcBorders>
-              <w:top w:val="single" w:sz="6" w:space="0" w:color="C4C7C5"/>
-              <w:left w:val="single" w:sz="6" w:space="0" w:color="C4C7C5"/>
-              <w:bottom w:val="single" w:sz="6" w:space="0" w:color="C4C7C5"/>
-              <w:right w:val="single" w:sz="6" w:space="0" w:color="C4C7C5"/>
-            </w:tcBorders>
-            <w:tcMar>
-              <w:top w:w="120" w:type="dxa"/>
-              <w:left w:w="180" w:type="dxa"/>
-              <w:bottom w:w="120" w:type="dxa"/>
-              <w:right w:w="180" w:type="dxa"/>
-            </w:tcMar>
-            <w:vAlign w:val="center"/>
-            <w:hideMark/>
-          </w:tcPr>
-          <w:p>
-            <w:pPr>
-              <w:spacing w:after="0" w:line="240" w:lineRule="auto"/>
+            <w:proofErr w:type="spellStart"/>
+            <w:r>
+              <w:rPr>
+                <w:rFonts w:ascii="Arial" w:hAnsi="Arial" w:cs="Arial"/>
+                <w:color w:val="000000"/>
+                <w:sz w:val="22"/>
+                <w:szCs w:val="22"/>
+              </w:rPr>
+              <w:t>Req</w:t>
+            </w:r>
+            <w:proofErr w:type="spellEnd"/>
+            <w:r>
+              <w:rPr>
+                <w:rFonts w:ascii="Arial" w:hAnsi="Arial" w:cs="Arial"/>
+                <w:color w:val="000000"/>
+                <w:sz w:val="22"/>
+                <w:szCs w:val="22"/>
+              </w:rPr>
+              <w:t>.</w:t>
+            </w:r>
+          </w:p>
+        </w:tc>
+        <w:tc>
+          <w:tcPr>
+            <w:tcW w:w="1843" w:type="dxa"/>
+            <w:vAlign w:val="center"/>
+          </w:tcPr>
+          <w:p>
+            <w:pPr>
               <w:jc w:val="center"/>
               <w:rPr>
                 <w:rFonts w:ascii="Arial" w:hAnsi="Arial" w:cs="Arial"/>
@@ -1742,6 +1798,7 @@
             <w:r>
               <w:rPr>
                 <w:rFonts w:ascii="Arial" w:hAnsi="Arial" w:cs="Arial"/>
+                <w:color w:val="000000"/>
                 <w:sz w:val="22"/>
                 <w:szCs w:val="22"/>
               </w:rPr>
@@ -1751,25 +1808,11 @@
         </w:tc>
         <w:tc>
           <w:tcPr>
-            <w:tcW w:w="2808" w:type="pct"/>
-            <w:tcBorders>
-              <w:top w:val="single" w:sz="6" w:space="0" w:color="C4C7C5"/>
-              <w:left w:val="single" w:sz="6" w:space="0" w:color="C4C7C5"/>
-              <w:bottom w:val="single" w:sz="6" w:space="0" w:color="C4C7C5"/>
-              <w:right w:val="single" w:sz="6" w:space="0" w:color="C4C7C5"/>
-            </w:tcBorders>
-            <w:tcMar>
-              <w:top w:w="120" w:type="dxa"/>
-              <w:left w:w="180" w:type="dxa"/>
-              <w:bottom w:w="120" w:type="dxa"/>
-              <w:right w:w="180" w:type="dxa"/>
-            </w:tcMar>
-            <w:vAlign w:val="center"/>
-            <w:hideMark/>
-          </w:tcPr>
-          <w:p>
-            <w:pPr>
-              <w:spacing w:after="0" w:line="240" w:lineRule="auto"/>
+            <w:tcW w:w="5103" w:type="dxa"/>
+            <w:vAlign w:val="center"/>
+          </w:tcPr>
+          <w:p>
+            <w:pPr>
               <w:jc w:val="center"/>
               <w:rPr>
                 <w:rFonts w:ascii="Arial" w:hAnsi="Arial" w:cs="Arial"/>
@@ -1780,6 +1823,7 @@
             <w:r>
               <w:rPr>
                 <w:rFonts w:ascii="Arial" w:hAnsi="Arial" w:cs="Arial"/>
+                <w:color w:val="000000"/>
                 <w:sz w:val="22"/>
                 <w:szCs w:val="22"/>
               </w:rPr>
@@ -1789,19 +1833,11 @@
         </w:tc>
         <w:tc>
           <w:tcPr>
-            <w:tcW w:w="832" w:type="pct"/>
-            <w:tcBorders>
-              <w:top w:val="single" w:sz="6" w:space="0" w:color="C4C7C5"/>
-              <w:left w:val="single" w:sz="6" w:space="0" w:color="C4C7C5"/>
-              <w:bottom w:val="single" w:sz="6" w:space="0" w:color="C4C7C5"/>
-              <w:right w:val="single" w:sz="6" w:space="0" w:color="C4C7C5"/>
-            </w:tcBorders>
-            <w:vAlign w:val="center"/>
-          </w:tcPr>
-          <w:p>
-            <w:pPr>
-              <w:spacing w:after="0" w:line="240" w:lineRule="auto"/>
-              <w:ind w:left="124"/>
+            <w:tcW w:w="1558" w:type="dxa"/>
+            <w:vAlign w:val="center"/>
+          </w:tcPr>
+          <w:p>
+            <w:pPr>
               <w:jc w:val="center"/>
               <w:rPr>
                 <w:rFonts w:ascii="Arial" w:hAnsi="Arial" w:cs="Arial"/>
@@ -1821,87 +1857,46 @@
         </w:tc>
       </w:tr>
       <w:tr>
-        <w:trPr>
-          <w:trHeight w:val="154"/>
-        </w:trPr>
-        <w:tc>
-          <w:tcPr>
-            <w:tcW w:w="441" w:type="pct"/>
+        <w:tc>
+          <w:tcPr>
+            <w:tcW w:w="846" w:type="dxa"/>
             <w:vMerge w:val="restart"/>
-            <w:tcBorders>
-              <w:top w:val="single" w:sz="6" w:space="0" w:color="C4C7C5"/>
-              <w:left w:val="single" w:sz="6" w:space="0" w:color="C4C7C5"/>
-              <w:bottom w:val="single" w:sz="6" w:space="0" w:color="C4C7C5"/>
-              <w:right w:val="single" w:sz="6" w:space="0" w:color="C4C7C5"/>
-            </w:tcBorders>
-            <w:tcMar>
-              <w:top w:w="120" w:type="dxa"/>
-              <w:left w:w="180" w:type="dxa"/>
-              <w:bottom w:w="120" w:type="dxa"/>
-              <w:right w:w="180" w:type="dxa"/>
-            </w:tcMar>
-            <w:vAlign w:val="center"/>
-            <w:hideMark/>
-          </w:tcPr>
-          <w:p>
-            <w:pPr>
-              <w:spacing w:after="0" w:line="240" w:lineRule="auto"/>
-              <w:rPr>
-                <w:rFonts w:ascii="Arial" w:hAnsi="Arial" w:cs="Arial"/>
-                <w:sz w:val="22"/>
-                <w:szCs w:val="22"/>
-              </w:rPr>
-            </w:pPr>
-            <w:r>
-              <w:rPr>
-                <w:rFonts w:ascii="Arial" w:hAnsi="Arial" w:cs="Arial"/>
-                <w:sz w:val="22"/>
-                <w:szCs w:val="22"/>
-              </w:rPr>
-              <w:t>RF-11</w:t>
-            </w:r>
-          </w:p>
-          <w:p>
-            <w:pPr>
-              <w:spacing w:after="0" w:line="240" w:lineRule="auto"/>
-              <w:rPr>
-                <w:rFonts w:ascii="Arial" w:hAnsi="Arial" w:cs="Arial"/>
-                <w:sz w:val="22"/>
-                <w:szCs w:val="22"/>
-              </w:rPr>
-            </w:pPr>
-          </w:p>
-        </w:tc>
-        <w:tc>
-          <w:tcPr>
-            <w:tcW w:w="918" w:type="pct"/>
-            <w:tcBorders>
-              <w:top w:val="single" w:sz="6" w:space="0" w:color="C4C7C5"/>
-              <w:left w:val="single" w:sz="6" w:space="0" w:color="C4C7C5"/>
-              <w:bottom w:val="single" w:sz="6" w:space="0" w:color="C4C7C5"/>
-              <w:right w:val="single" w:sz="6" w:space="0" w:color="C4C7C5"/>
-            </w:tcBorders>
-            <w:tcMar>
-              <w:top w:w="120" w:type="dxa"/>
-              <w:left w:w="180" w:type="dxa"/>
-              <w:bottom w:w="120" w:type="dxa"/>
-              <w:right w:w="180" w:type="dxa"/>
-            </w:tcMar>
-            <w:vAlign w:val="center"/>
-            <w:hideMark/>
-          </w:tcPr>
-          <w:p>
-            <w:pPr>
-              <w:spacing w:after="0" w:line="240" w:lineRule="auto"/>
-              <w:rPr>
-                <w:rFonts w:ascii="Arial" w:hAnsi="Arial" w:cs="Arial"/>
-                <w:sz w:val="22"/>
-                <w:szCs w:val="22"/>
-              </w:rPr>
-            </w:pPr>
-            <w:r>
-              <w:rPr>
-                <w:rFonts w:ascii="Arial" w:hAnsi="Arial" w:cs="Arial"/>
+            <w:vAlign w:val="center"/>
+          </w:tcPr>
+          <w:p>
+            <w:pPr>
+              <w:rPr>
+                <w:rFonts w:ascii="Arial" w:hAnsi="Arial" w:cs="Arial"/>
+                <w:sz w:val="22"/>
+                <w:szCs w:val="22"/>
+              </w:rPr>
+            </w:pPr>
+            <w:r>
+              <w:rPr>
+                <w:rFonts w:ascii="Arial" w:hAnsi="Arial" w:cs="Arial"/>
+                <w:sz w:val="22"/>
+                <w:szCs w:val="22"/>
+              </w:rPr>
+              <w:t>RF-13</w:t>
+            </w:r>
+          </w:p>
+        </w:tc>
+        <w:tc>
+          <w:tcPr>
+            <w:tcW w:w="1843" w:type="dxa"/>
+          </w:tcPr>
+          <w:p>
+            <w:pPr>
+              <w:rPr>
+                <w:rFonts w:ascii="Arial" w:hAnsi="Arial" w:cs="Arial"/>
+                <w:sz w:val="22"/>
+                <w:szCs w:val="22"/>
+              </w:rPr>
+            </w:pPr>
+            <w:r>
+              <w:rPr>
+                <w:rFonts w:ascii="Arial" w:hAnsi="Arial" w:cs="Arial"/>
+                <w:color w:val="000000"/>
                 <w:sz w:val="22"/>
                 <w:szCs w:val="22"/>
               </w:rPr>
@@ -1911,56 +1906,54 @@
         </w:tc>
         <w:tc>
           <w:tcPr>
-            <w:tcW w:w="2808" w:type="pct"/>
-            <w:tcBorders>
-              <w:top w:val="single" w:sz="6" w:space="0" w:color="C4C7C5"/>
-              <w:left w:val="single" w:sz="6" w:space="0" w:color="C4C7C5"/>
-              <w:bottom w:val="single" w:sz="6" w:space="0" w:color="C4C7C5"/>
-              <w:right w:val="single" w:sz="6" w:space="0" w:color="C4C7C5"/>
-            </w:tcBorders>
-            <w:tcMar>
-              <w:top w:w="120" w:type="dxa"/>
-              <w:left w:w="180" w:type="dxa"/>
-              <w:bottom w:w="120" w:type="dxa"/>
-              <w:right w:w="180" w:type="dxa"/>
-            </w:tcMar>
-            <w:vAlign w:val="center"/>
-            <w:hideMark/>
-          </w:tcPr>
-          <w:p>
-            <w:pPr>
-              <w:spacing w:after="0" w:line="240" w:lineRule="auto"/>
-              <w:rPr>
-                <w:rFonts w:ascii="Arial" w:hAnsi="Arial" w:cs="Arial"/>
-                <w:sz w:val="22"/>
-                <w:szCs w:val="22"/>
-              </w:rPr>
-            </w:pPr>
-            <w:r>
-              <w:rPr>
-                <w:rFonts w:ascii="Arial" w:hAnsi="Arial" w:cs="Arial"/>
-                <w:sz w:val="22"/>
-                <w:szCs w:val="22"/>
-              </w:rPr>
-              <w:t>Definir la entidad disponibilidades vinculada al perfil del usuario y el catálogo tipos_disponibilidad con sus atributos obligatorios de fecha y horas.</w:t>
-            </w:r>
-          </w:p>
-        </w:tc>
-        <w:tc>
-          <w:tcPr>
-            <w:tcW w:w="832" w:type="pct"/>
-            <w:tcBorders>
-              <w:top w:val="single" w:sz="6" w:space="0" w:color="C4C7C5"/>
-              <w:left w:val="single" w:sz="6" w:space="0" w:color="C4C7C5"/>
-              <w:bottom w:val="single" w:sz="6" w:space="0" w:color="C4C7C5"/>
-              <w:right w:val="single" w:sz="6" w:space="0" w:color="C4C7C5"/>
-            </w:tcBorders>
-            <w:vAlign w:val="center"/>
-          </w:tcPr>
-          <w:p>
-            <w:pPr>
-              <w:spacing w:after="0" w:line="240" w:lineRule="auto"/>
-              <w:ind w:left="124"/>
+            <w:tcW w:w="5103" w:type="dxa"/>
+          </w:tcPr>
+          <w:p>
+            <w:pPr>
+              <w:rPr>
+                <w:rFonts w:ascii="Arial" w:hAnsi="Arial" w:cs="Arial"/>
+                <w:sz w:val="22"/>
+                <w:szCs w:val="22"/>
+              </w:rPr>
+            </w:pPr>
+            <w:r>
+              <w:rPr>
+                <w:rFonts w:ascii="Arial" w:hAnsi="Arial" w:cs="Arial"/>
+                <w:color w:val="000000"/>
+                <w:sz w:val="22"/>
+                <w:szCs w:val="22"/>
+              </w:rPr>
+              <w:t xml:space="preserve">Definir la entidad contenedora </w:t>
+            </w:r>
+            <w:proofErr w:type="spellStart"/>
+            <w:r>
+              <w:rPr>
+                <w:rFonts w:ascii="Arial" w:hAnsi="Arial" w:cs="Arial"/>
+                <w:color w:val="000000"/>
+                <w:sz w:val="22"/>
+                <w:szCs w:val="22"/>
+              </w:rPr>
+              <w:t>series_eventos</w:t>
+            </w:r>
+            <w:proofErr w:type="spellEnd"/>
+            <w:r>
+              <w:rPr>
+                <w:rFonts w:ascii="Arial" w:hAnsi="Arial" w:cs="Arial"/>
+                <w:color w:val="000000"/>
+                <w:sz w:val="22"/>
+                <w:szCs w:val="22"/>
+              </w:rPr>
+              <w:t xml:space="preserve"> con reglas de periodicidad, fechas de inicio y finalización.</w:t>
+            </w:r>
+          </w:p>
+        </w:tc>
+        <w:tc>
+          <w:tcPr>
+            <w:tcW w:w="1558" w:type="dxa"/>
+            <w:vAlign w:val="center"/>
+          </w:tcPr>
+          <w:p>
+            <w:pPr>
               <w:rPr>
                 <w:rFonts w:ascii="Arial" w:hAnsi="Arial" w:cs="Arial"/>
                 <w:sz w:val="22"/>
@@ -1979,63 +1972,38 @@
         </w:tc>
       </w:tr>
       <w:tr>
-        <w:trPr>
-          <w:trHeight w:val="20"/>
-        </w:trPr>
-        <w:tc>
-          <w:tcPr>
-            <w:tcW w:w="441" w:type="pct"/>
+        <w:tc>
+          <w:tcPr>
+            <w:tcW w:w="846" w:type="dxa"/>
             <w:vMerge/>
-            <w:tcBorders>
-              <w:top w:val="single" w:sz="6" w:space="0" w:color="C4C7C5"/>
-              <w:left w:val="single" w:sz="6" w:space="0" w:color="C4C7C5"/>
-              <w:bottom w:val="single" w:sz="6" w:space="0" w:color="C4C7C5"/>
-              <w:right w:val="single" w:sz="6" w:space="0" w:color="C4C7C5"/>
-            </w:tcBorders>
-            <w:vAlign w:val="center"/>
-            <w:hideMark/>
-          </w:tcPr>
-          <w:p>
-            <w:pPr>
-              <w:spacing w:after="0" w:line="240" w:lineRule="auto"/>
-              <w:rPr>
-                <w:rFonts w:ascii="Arial" w:hAnsi="Arial" w:cs="Arial"/>
-                <w:sz w:val="22"/>
-                <w:szCs w:val="22"/>
-              </w:rPr>
-            </w:pPr>
-          </w:p>
-        </w:tc>
-        <w:tc>
-          <w:tcPr>
-            <w:tcW w:w="918" w:type="pct"/>
-            <w:tcBorders>
-              <w:top w:val="single" w:sz="6" w:space="0" w:color="C4C7C5"/>
-              <w:left w:val="single" w:sz="6" w:space="0" w:color="C4C7C5"/>
-              <w:bottom w:val="single" w:sz="6" w:space="0" w:color="C4C7C5"/>
-              <w:right w:val="single" w:sz="6" w:space="0" w:color="C4C7C5"/>
-            </w:tcBorders>
-            <w:tcMar>
-              <w:top w:w="120" w:type="dxa"/>
-              <w:left w:w="180" w:type="dxa"/>
-              <w:bottom w:w="120" w:type="dxa"/>
-              <w:right w:w="180" w:type="dxa"/>
-            </w:tcMar>
-            <w:vAlign w:val="center"/>
-            <w:hideMark/>
-          </w:tcPr>
-          <w:p>
-            <w:pPr>
-              <w:spacing w:after="0" w:line="240" w:lineRule="auto"/>
-              <w:rPr>
-                <w:rFonts w:ascii="Arial" w:hAnsi="Arial" w:cs="Arial"/>
-                <w:sz w:val="22"/>
-                <w:szCs w:val="22"/>
-              </w:rPr>
-            </w:pPr>
-            <w:r>
-              <w:rPr>
-                <w:rFonts w:ascii="Arial" w:hAnsi="Arial" w:cs="Arial"/>
+            <w:vAlign w:val="center"/>
+          </w:tcPr>
+          <w:p>
+            <w:pPr>
+              <w:rPr>
+                <w:rFonts w:ascii="Arial" w:hAnsi="Arial" w:cs="Arial"/>
+                <w:sz w:val="22"/>
+                <w:szCs w:val="22"/>
+              </w:rPr>
+            </w:pPr>
+          </w:p>
+        </w:tc>
+        <w:tc>
+          <w:tcPr>
+            <w:tcW w:w="1843" w:type="dxa"/>
+          </w:tcPr>
+          <w:p>
+            <w:pPr>
+              <w:rPr>
+                <w:rFonts w:ascii="Arial" w:hAnsi="Arial" w:cs="Arial"/>
+                <w:sz w:val="22"/>
+                <w:szCs w:val="22"/>
+              </w:rPr>
+            </w:pPr>
+            <w:r>
+              <w:rPr>
+                <w:rFonts w:ascii="Arial" w:hAnsi="Arial" w:cs="Arial"/>
+                <w:color w:val="000000"/>
                 <w:sz w:val="22"/>
                 <w:szCs w:val="22"/>
               </w:rPr>
@@ -2045,56 +2013,54 @@
         </w:tc>
         <w:tc>
           <w:tcPr>
-            <w:tcW w:w="2808" w:type="pct"/>
-            <w:tcBorders>
-              <w:top w:val="single" w:sz="6" w:space="0" w:color="C4C7C5"/>
-              <w:left w:val="single" w:sz="6" w:space="0" w:color="C4C7C5"/>
-              <w:bottom w:val="single" w:sz="6" w:space="0" w:color="C4C7C5"/>
-              <w:right w:val="single" w:sz="6" w:space="0" w:color="C4C7C5"/>
-            </w:tcBorders>
-            <w:tcMar>
-              <w:top w:w="120" w:type="dxa"/>
-              <w:left w:w="180" w:type="dxa"/>
-              <w:bottom w:w="120" w:type="dxa"/>
-              <w:right w:w="180" w:type="dxa"/>
-            </w:tcMar>
-            <w:vAlign w:val="center"/>
-            <w:hideMark/>
-          </w:tcPr>
-          <w:p>
-            <w:pPr>
-              <w:spacing w:after="0" w:line="240" w:lineRule="auto"/>
-              <w:rPr>
-                <w:rFonts w:ascii="Arial" w:hAnsi="Arial" w:cs="Arial"/>
-                <w:sz w:val="22"/>
-                <w:szCs w:val="22"/>
-              </w:rPr>
-            </w:pPr>
-            <w:r>
-              <w:rPr>
-                <w:rFonts w:ascii="Arial" w:hAnsi="Arial" w:cs="Arial"/>
-                <w:sz w:val="22"/>
-                <w:szCs w:val="22"/>
-              </w:rPr>
-              <w:t>Estructurar las tablas relacionales para el control de disponibilidades y su clave foranea hacia usuarios.</w:t>
-            </w:r>
-          </w:p>
-        </w:tc>
-        <w:tc>
-          <w:tcPr>
-            <w:tcW w:w="832" w:type="pct"/>
-            <w:tcBorders>
-              <w:top w:val="single" w:sz="6" w:space="0" w:color="C4C7C5"/>
-              <w:left w:val="single" w:sz="6" w:space="0" w:color="C4C7C5"/>
-              <w:bottom w:val="single" w:sz="6" w:space="0" w:color="C4C7C5"/>
-              <w:right w:val="single" w:sz="6" w:space="0" w:color="C4C7C5"/>
-            </w:tcBorders>
-            <w:vAlign w:val="center"/>
-          </w:tcPr>
-          <w:p>
-            <w:pPr>
-              <w:spacing w:after="0" w:line="240" w:lineRule="auto"/>
-              <w:ind w:left="124"/>
+            <w:tcW w:w="5103" w:type="dxa"/>
+          </w:tcPr>
+          <w:p>
+            <w:pPr>
+              <w:rPr>
+                <w:rFonts w:ascii="Arial" w:hAnsi="Arial" w:cs="Arial"/>
+                <w:sz w:val="22"/>
+                <w:szCs w:val="22"/>
+              </w:rPr>
+            </w:pPr>
+            <w:r>
+              <w:rPr>
+                <w:rFonts w:ascii="Arial" w:hAnsi="Arial" w:cs="Arial"/>
+                <w:color w:val="000000"/>
+                <w:sz w:val="22"/>
+                <w:szCs w:val="22"/>
+              </w:rPr>
+              <w:t xml:space="preserve">Diseñar la relación de uno a muchos entre </w:t>
+            </w:r>
+            <w:proofErr w:type="spellStart"/>
+            <w:r>
+              <w:rPr>
+                <w:rFonts w:ascii="Arial" w:hAnsi="Arial" w:cs="Arial"/>
+                <w:color w:val="000000"/>
+                <w:sz w:val="22"/>
+                <w:szCs w:val="22"/>
+              </w:rPr>
+              <w:t>series_eventos</w:t>
+            </w:r>
+            <w:proofErr w:type="spellEnd"/>
+            <w:r>
+              <w:rPr>
+                <w:rFonts w:ascii="Arial" w:hAnsi="Arial" w:cs="Arial"/>
+                <w:color w:val="000000"/>
+                <w:sz w:val="22"/>
+                <w:szCs w:val="22"/>
+              </w:rPr>
+              <w:t xml:space="preserve"> y las ocurrencias individuales de eventos.</w:t>
+            </w:r>
+          </w:p>
+        </w:tc>
+        <w:tc>
+          <w:tcPr>
+            <w:tcW w:w="1558" w:type="dxa"/>
+            <w:vAlign w:val="center"/>
+          </w:tcPr>
+          <w:p>
+            <w:pPr>
               <w:rPr>
                 <w:rFonts w:ascii="Arial" w:hAnsi="Arial" w:cs="Arial"/>
                 <w:sz w:val="22"/>
@@ -2113,63 +2079,38 @@
         </w:tc>
       </w:tr>
       <w:tr>
-        <w:trPr>
-          <w:trHeight w:val="20"/>
-        </w:trPr>
-        <w:tc>
-          <w:tcPr>
-            <w:tcW w:w="441" w:type="pct"/>
+        <w:tc>
+          <w:tcPr>
+            <w:tcW w:w="846" w:type="dxa"/>
             <w:vMerge/>
-            <w:tcBorders>
-              <w:top w:val="single" w:sz="6" w:space="0" w:color="C4C7C5"/>
-              <w:left w:val="single" w:sz="6" w:space="0" w:color="C4C7C5"/>
-              <w:bottom w:val="single" w:sz="6" w:space="0" w:color="C4C7C5"/>
-              <w:right w:val="single" w:sz="6" w:space="0" w:color="C4C7C5"/>
-            </w:tcBorders>
-            <w:vAlign w:val="center"/>
-            <w:hideMark/>
-          </w:tcPr>
-          <w:p>
-            <w:pPr>
-              <w:spacing w:after="0" w:line="240" w:lineRule="auto"/>
-              <w:rPr>
-                <w:rFonts w:ascii="Arial" w:hAnsi="Arial" w:cs="Arial"/>
-                <w:sz w:val="22"/>
-                <w:szCs w:val="22"/>
-              </w:rPr>
-            </w:pPr>
-          </w:p>
-        </w:tc>
-        <w:tc>
-          <w:tcPr>
-            <w:tcW w:w="918" w:type="pct"/>
-            <w:tcBorders>
-              <w:top w:val="single" w:sz="6" w:space="0" w:color="C4C7C5"/>
-              <w:left w:val="single" w:sz="6" w:space="0" w:color="C4C7C5"/>
-              <w:bottom w:val="single" w:sz="6" w:space="0" w:color="C4C7C5"/>
-              <w:right w:val="single" w:sz="6" w:space="0" w:color="C4C7C5"/>
-            </w:tcBorders>
-            <w:tcMar>
-              <w:top w:w="120" w:type="dxa"/>
-              <w:left w:w="180" w:type="dxa"/>
-              <w:bottom w:w="120" w:type="dxa"/>
-              <w:right w:w="180" w:type="dxa"/>
-            </w:tcMar>
-            <w:vAlign w:val="center"/>
-            <w:hideMark/>
-          </w:tcPr>
-          <w:p>
-            <w:pPr>
-              <w:spacing w:after="0" w:line="240" w:lineRule="auto"/>
-              <w:rPr>
-                <w:rFonts w:ascii="Arial" w:hAnsi="Arial" w:cs="Arial"/>
-                <w:sz w:val="22"/>
-                <w:szCs w:val="22"/>
-              </w:rPr>
-            </w:pPr>
-            <w:r>
-              <w:rPr>
-                <w:rFonts w:ascii="Arial" w:hAnsi="Arial" w:cs="Arial"/>
+            <w:vAlign w:val="center"/>
+          </w:tcPr>
+          <w:p>
+            <w:pPr>
+              <w:rPr>
+                <w:rFonts w:ascii="Arial" w:hAnsi="Arial" w:cs="Arial"/>
+                <w:sz w:val="22"/>
+                <w:szCs w:val="22"/>
+              </w:rPr>
+            </w:pPr>
+          </w:p>
+        </w:tc>
+        <w:tc>
+          <w:tcPr>
+            <w:tcW w:w="1843" w:type="dxa"/>
+          </w:tcPr>
+          <w:p>
+            <w:pPr>
+              <w:rPr>
+                <w:rFonts w:ascii="Arial" w:hAnsi="Arial" w:cs="Arial"/>
+                <w:sz w:val="22"/>
+                <w:szCs w:val="22"/>
+              </w:rPr>
+            </w:pPr>
+            <w:r>
+              <w:rPr>
+                <w:rFonts w:ascii="Arial" w:hAnsi="Arial" w:cs="Arial"/>
+                <w:color w:val="000000"/>
                 <w:sz w:val="22"/>
                 <w:szCs w:val="22"/>
               </w:rPr>
@@ -2179,56 +2120,54 @@
         </w:tc>
         <w:tc>
           <w:tcPr>
-            <w:tcW w:w="2808" w:type="pct"/>
-            <w:tcBorders>
-              <w:top w:val="single" w:sz="6" w:space="0" w:color="C4C7C5"/>
-              <w:left w:val="single" w:sz="6" w:space="0" w:color="C4C7C5"/>
-              <w:bottom w:val="single" w:sz="6" w:space="0" w:color="C4C7C5"/>
-              <w:right w:val="single" w:sz="6" w:space="0" w:color="C4C7C5"/>
-            </w:tcBorders>
-            <w:tcMar>
-              <w:top w:w="120" w:type="dxa"/>
-              <w:left w:w="180" w:type="dxa"/>
-              <w:bottom w:w="120" w:type="dxa"/>
-              <w:right w:w="180" w:type="dxa"/>
-            </w:tcMar>
-            <w:vAlign w:val="center"/>
-            <w:hideMark/>
-          </w:tcPr>
-          <w:p>
-            <w:pPr>
-              <w:spacing w:after="0" w:line="240" w:lineRule="auto"/>
-              <w:rPr>
-                <w:rFonts w:ascii="Arial" w:hAnsi="Arial" w:cs="Arial"/>
-                <w:sz w:val="22"/>
-                <w:szCs w:val="22"/>
-              </w:rPr>
-            </w:pPr>
-            <w:r>
-              <w:rPr>
-                <w:rFonts w:ascii="Arial" w:hAnsi="Arial" w:cs="Arial"/>
-                <w:sz w:val="22"/>
-                <w:szCs w:val="22"/>
-              </w:rPr>
-              <w:t>Codificar la creación de tablas y catálogos en PostgreSQL asegurando la integridad de las franjas temporales.</w:t>
-            </w:r>
-          </w:p>
-        </w:tc>
-        <w:tc>
-          <w:tcPr>
-            <w:tcW w:w="832" w:type="pct"/>
-            <w:tcBorders>
-              <w:top w:val="single" w:sz="6" w:space="0" w:color="C4C7C5"/>
-              <w:left w:val="single" w:sz="6" w:space="0" w:color="C4C7C5"/>
-              <w:bottom w:val="single" w:sz="6" w:space="0" w:color="C4C7C5"/>
-              <w:right w:val="single" w:sz="6" w:space="0" w:color="C4C7C5"/>
-            </w:tcBorders>
-            <w:vAlign w:val="center"/>
-          </w:tcPr>
-          <w:p>
-            <w:pPr>
-              <w:spacing w:after="0" w:line="240" w:lineRule="auto"/>
-              <w:ind w:left="124"/>
+            <w:tcW w:w="5103" w:type="dxa"/>
+          </w:tcPr>
+          <w:p>
+            <w:pPr>
+              <w:rPr>
+                <w:rFonts w:ascii="Arial" w:hAnsi="Arial" w:cs="Arial"/>
+                <w:sz w:val="22"/>
+                <w:szCs w:val="22"/>
+              </w:rPr>
+            </w:pPr>
+            <w:r>
+              <w:rPr>
+                <w:rFonts w:ascii="Arial" w:hAnsi="Arial" w:cs="Arial"/>
+                <w:color w:val="000000"/>
+                <w:sz w:val="22"/>
+                <w:szCs w:val="22"/>
+              </w:rPr>
+              <w:t xml:space="preserve">Implementar la estructura de la tabla </w:t>
+            </w:r>
+            <w:proofErr w:type="spellStart"/>
+            <w:r>
+              <w:rPr>
+                <w:rFonts w:ascii="Arial" w:hAnsi="Arial" w:cs="Arial"/>
+                <w:color w:val="000000"/>
+                <w:sz w:val="22"/>
+                <w:szCs w:val="22"/>
+              </w:rPr>
+              <w:t>series_eventos</w:t>
+            </w:r>
+            <w:proofErr w:type="spellEnd"/>
+            <w:r>
+              <w:rPr>
+                <w:rFonts w:ascii="Arial" w:hAnsi="Arial" w:cs="Arial"/>
+                <w:color w:val="000000"/>
+                <w:sz w:val="22"/>
+                <w:szCs w:val="22"/>
+              </w:rPr>
+              <w:t xml:space="preserve"> y su ligadura referencial en PostgreSQL.</w:t>
+            </w:r>
+          </w:p>
+        </w:tc>
+        <w:tc>
+          <w:tcPr>
+            <w:tcW w:w="1558" w:type="dxa"/>
+            <w:vAlign w:val="center"/>
+          </w:tcPr>
+          <w:p>
+            <w:pPr>
               <w:rPr>
                 <w:rFonts w:ascii="Arial" w:hAnsi="Arial" w:cs="Arial"/>
                 <w:sz w:val="22"/>
@@ -2247,63 +2186,38 @@
         </w:tc>
       </w:tr>
       <w:tr>
-        <w:trPr>
-          <w:trHeight w:val="20"/>
-        </w:trPr>
-        <w:tc>
-          <w:tcPr>
-            <w:tcW w:w="441" w:type="pct"/>
+        <w:tc>
+          <w:tcPr>
+            <w:tcW w:w="846" w:type="dxa"/>
             <w:vMerge/>
-            <w:tcBorders>
-              <w:top w:val="single" w:sz="6" w:space="0" w:color="C4C7C5"/>
-              <w:left w:val="single" w:sz="6" w:space="0" w:color="C4C7C5"/>
-              <w:bottom w:val="single" w:sz="6" w:space="0" w:color="C4C7C5"/>
-              <w:right w:val="single" w:sz="6" w:space="0" w:color="C4C7C5"/>
-            </w:tcBorders>
-            <w:vAlign w:val="center"/>
-            <w:hideMark/>
-          </w:tcPr>
-          <w:p>
-            <w:pPr>
-              <w:spacing w:after="0" w:line="240" w:lineRule="auto"/>
-              <w:rPr>
-                <w:rFonts w:ascii="Arial" w:hAnsi="Arial" w:cs="Arial"/>
-                <w:sz w:val="22"/>
-                <w:szCs w:val="22"/>
-              </w:rPr>
-            </w:pPr>
-          </w:p>
-        </w:tc>
-        <w:tc>
-          <w:tcPr>
-            <w:tcW w:w="918" w:type="pct"/>
-            <w:tcBorders>
-              <w:top w:val="single" w:sz="6" w:space="0" w:color="C4C7C5"/>
-              <w:left w:val="single" w:sz="6" w:space="0" w:color="C4C7C5"/>
-              <w:bottom w:val="single" w:sz="6" w:space="0" w:color="C4C7C5"/>
-              <w:right w:val="single" w:sz="6" w:space="0" w:color="C4C7C5"/>
-            </w:tcBorders>
-            <w:tcMar>
-              <w:top w:w="120" w:type="dxa"/>
-              <w:left w:w="180" w:type="dxa"/>
-              <w:bottom w:w="120" w:type="dxa"/>
-              <w:right w:w="180" w:type="dxa"/>
-            </w:tcMar>
-            <w:vAlign w:val="center"/>
-            <w:hideMark/>
-          </w:tcPr>
-          <w:p>
-            <w:pPr>
-              <w:spacing w:after="0" w:line="240" w:lineRule="auto"/>
-              <w:rPr>
-                <w:rFonts w:ascii="Arial" w:hAnsi="Arial" w:cs="Arial"/>
-                <w:sz w:val="22"/>
-                <w:szCs w:val="22"/>
-              </w:rPr>
-            </w:pPr>
-            <w:r>
-              <w:rPr>
-                <w:rFonts w:ascii="Arial" w:hAnsi="Arial" w:cs="Arial"/>
+            <w:vAlign w:val="center"/>
+          </w:tcPr>
+          <w:p>
+            <w:pPr>
+              <w:rPr>
+                <w:rFonts w:ascii="Arial" w:hAnsi="Arial" w:cs="Arial"/>
+                <w:sz w:val="22"/>
+                <w:szCs w:val="22"/>
+              </w:rPr>
+            </w:pPr>
+          </w:p>
+        </w:tc>
+        <w:tc>
+          <w:tcPr>
+            <w:tcW w:w="1843" w:type="dxa"/>
+          </w:tcPr>
+          <w:p>
+            <w:pPr>
+              <w:rPr>
+                <w:rFonts w:ascii="Arial" w:hAnsi="Arial" w:cs="Arial"/>
+                <w:sz w:val="22"/>
+                <w:szCs w:val="22"/>
+              </w:rPr>
+            </w:pPr>
+            <w:r>
+              <w:rPr>
+                <w:rFonts w:ascii="Arial" w:hAnsi="Arial" w:cs="Arial"/>
+                <w:color w:val="000000"/>
                 <w:sz w:val="22"/>
                 <w:szCs w:val="22"/>
               </w:rPr>
@@ -2313,56 +2227,34 @@
         </w:tc>
         <w:tc>
           <w:tcPr>
-            <w:tcW w:w="2808" w:type="pct"/>
-            <w:tcBorders>
-              <w:top w:val="single" w:sz="6" w:space="0" w:color="C4C7C5"/>
-              <w:left w:val="single" w:sz="6" w:space="0" w:color="C4C7C5"/>
-              <w:bottom w:val="single" w:sz="6" w:space="0" w:color="C4C7C5"/>
-              <w:right w:val="single" w:sz="6" w:space="0" w:color="C4C7C5"/>
-            </w:tcBorders>
-            <w:tcMar>
-              <w:top w:w="120" w:type="dxa"/>
-              <w:left w:w="180" w:type="dxa"/>
-              <w:bottom w:w="120" w:type="dxa"/>
-              <w:right w:w="180" w:type="dxa"/>
-            </w:tcMar>
-            <w:vAlign w:val="center"/>
-            <w:hideMark/>
-          </w:tcPr>
-          <w:p>
-            <w:pPr>
-              <w:spacing w:after="0" w:line="240" w:lineRule="auto"/>
-              <w:rPr>
-                <w:rFonts w:ascii="Arial" w:hAnsi="Arial" w:cs="Arial"/>
-                <w:sz w:val="22"/>
-                <w:szCs w:val="22"/>
-              </w:rPr>
-            </w:pPr>
-            <w:r>
-              <w:rPr>
-                <w:rFonts w:ascii="Arial" w:hAnsi="Arial" w:cs="Arial"/>
-                <w:sz w:val="22"/>
-                <w:szCs w:val="22"/>
-              </w:rPr>
-              <w:t>Desarrollar el módulo en la interfaz para que los usuarios administren sus periodos libres u ocupados mediante operaciones CRUD completas.</w:t>
-            </w:r>
-          </w:p>
-        </w:tc>
-        <w:tc>
-          <w:tcPr>
-            <w:tcW w:w="832" w:type="pct"/>
-            <w:tcBorders>
-              <w:top w:val="single" w:sz="6" w:space="0" w:color="C4C7C5"/>
-              <w:left w:val="single" w:sz="6" w:space="0" w:color="C4C7C5"/>
-              <w:bottom w:val="single" w:sz="6" w:space="0" w:color="C4C7C5"/>
-              <w:right w:val="single" w:sz="6" w:space="0" w:color="C4C7C5"/>
-            </w:tcBorders>
-            <w:vAlign w:val="center"/>
-          </w:tcPr>
-          <w:p>
-            <w:pPr>
-              <w:spacing w:after="0" w:line="240" w:lineRule="auto"/>
-              <w:ind w:left="124"/>
+            <w:tcW w:w="5103" w:type="dxa"/>
+          </w:tcPr>
+          <w:p>
+            <w:pPr>
+              <w:rPr>
+                <w:rFonts w:ascii="Arial" w:hAnsi="Arial" w:cs="Arial"/>
+                <w:sz w:val="22"/>
+                <w:szCs w:val="22"/>
+              </w:rPr>
+            </w:pPr>
+            <w:r>
+              <w:rPr>
+                <w:rFonts w:ascii="Arial" w:hAnsi="Arial" w:cs="Arial"/>
+                <w:color w:val="000000"/>
+                <w:sz w:val="22"/>
+                <w:szCs w:val="22"/>
+              </w:rPr>
+              <w:t>Diseñar formularios en la GUI para la administración y visualización estructurada de las series periódicas.</w:t>
+            </w:r>
+          </w:p>
+        </w:tc>
+        <w:tc>
+          <w:tcPr>
+            <w:tcW w:w="1558" w:type="dxa"/>
+            <w:vAlign w:val="center"/>
+          </w:tcPr>
+          <w:p>
+            <w:pPr>
               <w:rPr>
                 <w:rFonts w:ascii="Arial" w:hAnsi="Arial" w:cs="Arial"/>
                 <w:sz w:val="22"/>
@@ -2381,87 +2273,46 @@
         </w:tc>
       </w:tr>
       <w:tr>
-        <w:trPr>
-          <w:trHeight w:val="20"/>
-        </w:trPr>
-        <w:tc>
-          <w:tcPr>
-            <w:tcW w:w="441" w:type="pct"/>
+        <w:tc>
+          <w:tcPr>
+            <w:tcW w:w="846" w:type="dxa"/>
             <w:vMerge w:val="restart"/>
-            <w:tcBorders>
-              <w:top w:val="single" w:sz="6" w:space="0" w:color="C4C7C5"/>
-              <w:left w:val="single" w:sz="6" w:space="0" w:color="C4C7C5"/>
-              <w:bottom w:val="single" w:sz="6" w:space="0" w:color="C4C7C5"/>
-              <w:right w:val="single" w:sz="6" w:space="0" w:color="C4C7C5"/>
-            </w:tcBorders>
-            <w:tcMar>
-              <w:top w:w="120" w:type="dxa"/>
-              <w:left w:w="180" w:type="dxa"/>
-              <w:bottom w:w="120" w:type="dxa"/>
-              <w:right w:w="180" w:type="dxa"/>
-            </w:tcMar>
-            <w:vAlign w:val="center"/>
-            <w:hideMark/>
-          </w:tcPr>
-          <w:p>
-            <w:pPr>
-              <w:spacing w:after="0" w:line="240" w:lineRule="auto"/>
-              <w:rPr>
-                <w:rFonts w:ascii="Arial" w:hAnsi="Arial" w:cs="Arial"/>
-                <w:sz w:val="22"/>
-                <w:szCs w:val="22"/>
-              </w:rPr>
-            </w:pPr>
-            <w:r>
-              <w:rPr>
-                <w:rFonts w:ascii="Arial" w:hAnsi="Arial" w:cs="Arial"/>
-                <w:sz w:val="22"/>
-                <w:szCs w:val="22"/>
-              </w:rPr>
-              <w:t>RF-12</w:t>
-            </w:r>
-          </w:p>
-          <w:p>
-            <w:pPr>
-              <w:spacing w:after="0" w:line="240" w:lineRule="auto"/>
-              <w:rPr>
-                <w:rFonts w:ascii="Arial" w:hAnsi="Arial" w:cs="Arial"/>
-                <w:sz w:val="22"/>
-                <w:szCs w:val="22"/>
-              </w:rPr>
-            </w:pPr>
-          </w:p>
-        </w:tc>
-        <w:tc>
-          <w:tcPr>
-            <w:tcW w:w="918" w:type="pct"/>
-            <w:tcBorders>
-              <w:top w:val="single" w:sz="6" w:space="0" w:color="C4C7C5"/>
-              <w:left w:val="single" w:sz="6" w:space="0" w:color="C4C7C5"/>
-              <w:bottom w:val="single" w:sz="6" w:space="0" w:color="C4C7C5"/>
-              <w:right w:val="single" w:sz="6" w:space="0" w:color="C4C7C5"/>
-            </w:tcBorders>
-            <w:tcMar>
-              <w:top w:w="120" w:type="dxa"/>
-              <w:left w:w="180" w:type="dxa"/>
-              <w:bottom w:w="120" w:type="dxa"/>
-              <w:right w:w="180" w:type="dxa"/>
-            </w:tcMar>
-            <w:vAlign w:val="center"/>
-            <w:hideMark/>
-          </w:tcPr>
-          <w:p>
-            <w:pPr>
-              <w:spacing w:after="0" w:line="240" w:lineRule="auto"/>
-              <w:rPr>
-                <w:rFonts w:ascii="Arial" w:hAnsi="Arial" w:cs="Arial"/>
-                <w:sz w:val="22"/>
-                <w:szCs w:val="22"/>
-              </w:rPr>
-            </w:pPr>
-            <w:r>
-              <w:rPr>
-                <w:rFonts w:ascii="Arial" w:hAnsi="Arial" w:cs="Arial"/>
+            <w:vAlign w:val="center"/>
+          </w:tcPr>
+          <w:p>
+            <w:pPr>
+              <w:rPr>
+                <w:rFonts w:ascii="Arial" w:hAnsi="Arial" w:cs="Arial"/>
+                <w:sz w:val="22"/>
+                <w:szCs w:val="22"/>
+              </w:rPr>
+            </w:pPr>
+            <w:r>
+              <w:rPr>
+                <w:rFonts w:ascii="Arial" w:hAnsi="Arial" w:cs="Arial"/>
+                <w:sz w:val="22"/>
+                <w:szCs w:val="22"/>
+              </w:rPr>
+              <w:t>RF-14</w:t>
+            </w:r>
+          </w:p>
+        </w:tc>
+        <w:tc>
+          <w:tcPr>
+            <w:tcW w:w="1843" w:type="dxa"/>
+          </w:tcPr>
+          <w:p>
+            <w:pPr>
+              <w:rPr>
+                <w:rFonts w:ascii="Arial" w:hAnsi="Arial" w:cs="Arial"/>
+                <w:sz w:val="22"/>
+                <w:szCs w:val="22"/>
+              </w:rPr>
+            </w:pPr>
+            <w:r>
+              <w:rPr>
+                <w:rFonts w:ascii="Arial" w:hAnsi="Arial" w:cs="Arial"/>
+                <w:color w:val="000000"/>
                 <w:sz w:val="22"/>
                 <w:szCs w:val="22"/>
               </w:rPr>
@@ -2471,56 +2322,34 @@
         </w:tc>
         <w:tc>
           <w:tcPr>
-            <w:tcW w:w="2808" w:type="pct"/>
-            <w:tcBorders>
-              <w:top w:val="single" w:sz="6" w:space="0" w:color="C4C7C5"/>
-              <w:left w:val="single" w:sz="6" w:space="0" w:color="C4C7C5"/>
-              <w:bottom w:val="single" w:sz="6" w:space="0" w:color="C4C7C5"/>
-              <w:right w:val="single" w:sz="6" w:space="0" w:color="C4C7C5"/>
-            </w:tcBorders>
-            <w:tcMar>
-              <w:top w:w="120" w:type="dxa"/>
-              <w:left w:w="180" w:type="dxa"/>
-              <w:bottom w:w="120" w:type="dxa"/>
-              <w:right w:w="180" w:type="dxa"/>
-            </w:tcMar>
-            <w:vAlign w:val="center"/>
-            <w:hideMark/>
-          </w:tcPr>
-          <w:p>
-            <w:pPr>
-              <w:spacing w:after="0" w:line="240" w:lineRule="auto"/>
-              <w:rPr>
-                <w:rFonts w:ascii="Arial" w:hAnsi="Arial" w:cs="Arial"/>
-                <w:sz w:val="22"/>
-                <w:szCs w:val="22"/>
-              </w:rPr>
-            </w:pPr>
-            <w:r>
-              <w:rPr>
-                <w:rFonts w:ascii="Arial" w:hAnsi="Arial" w:cs="Arial"/>
-                <w:sz w:val="22"/>
-                <w:szCs w:val="22"/>
-              </w:rPr>
-              <w:t>Estructurar las consultas analíticas en el motor de base de datos para la detección de cruces o traslapes temporales entre eventos y disponibilidades.</w:t>
-            </w:r>
-          </w:p>
-        </w:tc>
-        <w:tc>
-          <w:tcPr>
-            <w:tcW w:w="832" w:type="pct"/>
-            <w:tcBorders>
-              <w:top w:val="single" w:sz="6" w:space="0" w:color="C4C7C5"/>
-              <w:left w:val="single" w:sz="6" w:space="0" w:color="C4C7C5"/>
-              <w:bottom w:val="single" w:sz="6" w:space="0" w:color="C4C7C5"/>
-              <w:right w:val="single" w:sz="6" w:space="0" w:color="C4C7C5"/>
-            </w:tcBorders>
-            <w:vAlign w:val="center"/>
-          </w:tcPr>
-          <w:p>
-            <w:pPr>
-              <w:spacing w:after="0" w:line="240" w:lineRule="auto"/>
-              <w:ind w:left="124"/>
+            <w:tcW w:w="5103" w:type="dxa"/>
+          </w:tcPr>
+          <w:p>
+            <w:pPr>
+              <w:rPr>
+                <w:rFonts w:ascii="Arial" w:hAnsi="Arial" w:cs="Arial"/>
+                <w:sz w:val="22"/>
+                <w:szCs w:val="22"/>
+              </w:rPr>
+            </w:pPr>
+            <w:r>
+              <w:rPr>
+                <w:rFonts w:ascii="Arial" w:hAnsi="Arial" w:cs="Arial"/>
+                <w:color w:val="000000"/>
+                <w:sz w:val="22"/>
+                <w:szCs w:val="22"/>
+              </w:rPr>
+              <w:t>Preparar las consultas e instrucciones de manipulación de fechas en el motor de base de datos para procesar el desglose de ocurrencias periódicas.</w:t>
+            </w:r>
+          </w:p>
+        </w:tc>
+        <w:tc>
+          <w:tcPr>
+            <w:tcW w:w="1558" w:type="dxa"/>
+            <w:vAlign w:val="center"/>
+          </w:tcPr>
+          <w:p>
+            <w:pPr>
               <w:rPr>
                 <w:rFonts w:ascii="Arial" w:hAnsi="Arial" w:cs="Arial"/>
                 <w:sz w:val="22"/>
@@ -2539,63 +2368,38 @@
         </w:tc>
       </w:tr>
       <w:tr>
-        <w:trPr>
-          <w:trHeight w:val="20"/>
-        </w:trPr>
-        <w:tc>
-          <w:tcPr>
-            <w:tcW w:w="441" w:type="pct"/>
+        <w:tc>
+          <w:tcPr>
+            <w:tcW w:w="846" w:type="dxa"/>
             <w:vMerge/>
-            <w:tcBorders>
-              <w:top w:val="single" w:sz="6" w:space="0" w:color="C4C7C5"/>
-              <w:left w:val="single" w:sz="6" w:space="0" w:color="C4C7C5"/>
-              <w:bottom w:val="single" w:sz="6" w:space="0" w:color="C4C7C5"/>
-              <w:right w:val="single" w:sz="6" w:space="0" w:color="C4C7C5"/>
-            </w:tcBorders>
-            <w:vAlign w:val="center"/>
-            <w:hideMark/>
-          </w:tcPr>
-          <w:p>
-            <w:pPr>
-              <w:spacing w:after="0" w:line="240" w:lineRule="auto"/>
-              <w:rPr>
-                <w:rFonts w:ascii="Arial" w:hAnsi="Arial" w:cs="Arial"/>
-                <w:sz w:val="22"/>
-                <w:szCs w:val="22"/>
-              </w:rPr>
-            </w:pPr>
-          </w:p>
-        </w:tc>
-        <w:tc>
-          <w:tcPr>
-            <w:tcW w:w="918" w:type="pct"/>
-            <w:tcBorders>
-              <w:top w:val="single" w:sz="6" w:space="0" w:color="C4C7C5"/>
-              <w:left w:val="single" w:sz="6" w:space="0" w:color="C4C7C5"/>
-              <w:bottom w:val="single" w:sz="6" w:space="0" w:color="C4C7C5"/>
-              <w:right w:val="single" w:sz="6" w:space="0" w:color="C4C7C5"/>
-            </w:tcBorders>
-            <w:tcMar>
-              <w:top w:w="120" w:type="dxa"/>
-              <w:left w:w="180" w:type="dxa"/>
-              <w:bottom w:w="120" w:type="dxa"/>
-              <w:right w:w="180" w:type="dxa"/>
-            </w:tcMar>
-            <w:vAlign w:val="center"/>
-            <w:hideMark/>
-          </w:tcPr>
-          <w:p>
-            <w:pPr>
-              <w:spacing w:after="0" w:line="240" w:lineRule="auto"/>
-              <w:rPr>
-                <w:rFonts w:ascii="Arial" w:hAnsi="Arial" w:cs="Arial"/>
-                <w:sz w:val="22"/>
-                <w:szCs w:val="22"/>
-              </w:rPr>
-            </w:pPr>
-            <w:r>
-              <w:rPr>
-                <w:rFonts w:ascii="Arial" w:hAnsi="Arial" w:cs="Arial"/>
+            <w:vAlign w:val="center"/>
+          </w:tcPr>
+          <w:p>
+            <w:pPr>
+              <w:rPr>
+                <w:rFonts w:ascii="Arial" w:hAnsi="Arial" w:cs="Arial"/>
+                <w:sz w:val="22"/>
+                <w:szCs w:val="22"/>
+              </w:rPr>
+            </w:pPr>
+          </w:p>
+        </w:tc>
+        <w:tc>
+          <w:tcPr>
+            <w:tcW w:w="1843" w:type="dxa"/>
+          </w:tcPr>
+          <w:p>
+            <w:pPr>
+              <w:rPr>
+                <w:rFonts w:ascii="Arial" w:hAnsi="Arial" w:cs="Arial"/>
+                <w:sz w:val="22"/>
+                <w:szCs w:val="22"/>
+              </w:rPr>
+            </w:pPr>
+            <w:r>
+              <w:rPr>
+                <w:rFonts w:ascii="Arial" w:hAnsi="Arial" w:cs="Arial"/>
+                <w:color w:val="000000"/>
                 <w:sz w:val="22"/>
                 <w:szCs w:val="22"/>
               </w:rPr>
@@ -2605,56 +2409,34 @@
         </w:tc>
         <w:tc>
           <w:tcPr>
-            <w:tcW w:w="2808" w:type="pct"/>
-            <w:tcBorders>
-              <w:top w:val="single" w:sz="6" w:space="0" w:color="C4C7C5"/>
-              <w:left w:val="single" w:sz="6" w:space="0" w:color="C4C7C5"/>
-              <w:bottom w:val="single" w:sz="6" w:space="0" w:color="C4C7C5"/>
-              <w:right w:val="single" w:sz="6" w:space="0" w:color="C4C7C5"/>
-            </w:tcBorders>
-            <w:tcMar>
-              <w:top w:w="120" w:type="dxa"/>
-              <w:left w:w="180" w:type="dxa"/>
-              <w:bottom w:w="120" w:type="dxa"/>
-              <w:right w:w="180" w:type="dxa"/>
-            </w:tcMar>
-            <w:vAlign w:val="center"/>
-            <w:hideMark/>
-          </w:tcPr>
-          <w:p>
-            <w:pPr>
-              <w:spacing w:after="0" w:line="240" w:lineRule="auto"/>
-              <w:rPr>
-                <w:rFonts w:ascii="Arial" w:hAnsi="Arial" w:cs="Arial"/>
-                <w:sz w:val="22"/>
-                <w:szCs w:val="22"/>
-              </w:rPr>
-            </w:pPr>
-            <w:r>
-              <w:rPr>
-                <w:rFonts w:ascii="Arial" w:hAnsi="Arial" w:cs="Arial"/>
-                <w:sz w:val="22"/>
-                <w:szCs w:val="22"/>
-              </w:rPr>
-              <w:t>Integrar las salidas analíticas en la GUI para determinar automáticamente usuarios libres y disponibles en un rango horario específico.</w:t>
-            </w:r>
-          </w:p>
-        </w:tc>
-        <w:tc>
-          <w:tcPr>
-            <w:tcW w:w="832" w:type="pct"/>
-            <w:tcBorders>
-              <w:top w:val="single" w:sz="6" w:space="0" w:color="C4C7C5"/>
-              <w:left w:val="single" w:sz="6" w:space="0" w:color="C4C7C5"/>
-              <w:bottom w:val="single" w:sz="6" w:space="0" w:color="C4C7C5"/>
-              <w:right w:val="single" w:sz="6" w:space="0" w:color="C4C7C5"/>
-            </w:tcBorders>
-            <w:vAlign w:val="center"/>
-          </w:tcPr>
-          <w:p>
-            <w:pPr>
-              <w:spacing w:after="0" w:line="240" w:lineRule="auto"/>
-              <w:ind w:left="124"/>
+            <w:tcW w:w="5103" w:type="dxa"/>
+          </w:tcPr>
+          <w:p>
+            <w:pPr>
+              <w:rPr>
+                <w:rFonts w:ascii="Arial" w:hAnsi="Arial" w:cs="Arial"/>
+                <w:sz w:val="22"/>
+                <w:szCs w:val="22"/>
+              </w:rPr>
+            </w:pPr>
+            <w:r>
+              <w:rPr>
+                <w:rFonts w:ascii="Arial" w:hAnsi="Arial" w:cs="Arial"/>
+                <w:color w:val="000000"/>
+                <w:sz w:val="22"/>
+                <w:szCs w:val="22"/>
+              </w:rPr>
+              <w:t>Incorporar en la interfaz gráfica un mecanismo de control y botones de acción en Python para configurar, insertar y administrar el desglose de los eventos hijos.</w:t>
+            </w:r>
+          </w:p>
+        </w:tc>
+        <w:tc>
+          <w:tcPr>
+            <w:tcW w:w="1558" w:type="dxa"/>
+            <w:vAlign w:val="center"/>
+          </w:tcPr>
+          <w:p>
+            <w:pPr>
               <w:rPr>
                 <w:rFonts w:ascii="Arial" w:hAnsi="Arial" w:cs="Arial"/>
                 <w:sz w:val="22"/>
@@ -2673,15 +2455,6 @@
         </w:tc>
       </w:tr>
     </w:tbl>
-    <w:p>
-      <w:pPr>
-        <w:rPr>
-          <w:rFonts w:ascii="Arial" w:hAnsi="Arial" w:cs="Arial"/>
-          <w:sz w:val="22"/>
-          <w:szCs w:val="22"/>
-        </w:rPr>
-      </w:pPr>
-    </w:p>
     <w:p>
       <w:pPr>
         <w:rPr>
@@ -2774,13 +2547,23 @@
                 <w:szCs w:val="22"/>
               </w:rPr>
             </w:pPr>
-            <w:r>
-              <w:rPr>
-                <w:rFonts w:ascii="Arial" w:hAnsi="Arial" w:cs="Arial"/>
-                <w:sz w:val="22"/>
-                <w:szCs w:val="22"/>
-              </w:rPr>
-              <w:t>Req.</w:t>
+            <w:proofErr w:type="spellStart"/>
+            <w:r>
+              <w:rPr>
+                <w:rFonts w:ascii="Arial" w:hAnsi="Arial" w:cs="Arial"/>
+                <w:sz w:val="22"/>
+                <w:szCs w:val="22"/>
+              </w:rPr>
+              <w:t>Req</w:t>
+            </w:r>
+            <w:proofErr w:type="spellEnd"/>
+            <w:r>
+              <w:rPr>
+                <w:rFonts w:ascii="Arial" w:hAnsi="Arial" w:cs="Arial"/>
+                <w:sz w:val="22"/>
+                <w:szCs w:val="22"/>
+              </w:rPr>
+              <w:t>.</w:t>
             </w:r>
           </w:p>
         </w:tc>
@@ -5278,6 +5061,25 @@
       <w:spacing w:val="5"/>
     </w:rPr>
   </w:style>
+  <w:style w:type="table" w:styleId="Tablaconcuadrcula">
+    <w:name w:val="Table Grid"/>
+    <w:basedOn w:val="Tablanormal"/>
+    <w:uiPriority w:val="39"/>
+    <w:rsid w:val="00044298"/>
+    <w:pPr>
+      <w:spacing w:after="0" w:line="240" w:lineRule="auto"/>
+    </w:pPr>
+    <w:tblPr>
+      <w:tblBorders>
+        <w:top w:val="single" w:sz="4" w:space="0" w:color="auto"/>
+        <w:left w:val="single" w:sz="4" w:space="0" w:color="auto"/>
+        <w:bottom w:val="single" w:sz="4" w:space="0" w:color="auto"/>
+        <w:right w:val="single" w:sz="4" w:space="0" w:color="auto"/>
+        <w:insideH w:val="single" w:sz="4" w:space="0" w:color="auto"/>
+        <w:insideV w:val="single" w:sz="4" w:space="0" w:color="auto"/>
+      </w:tblBorders>
+    </w:tblPr>
+  </w:style>
 </w:styles>
 </file>
 

</xml_diff>

<commit_message>
Update Matriz de Tazabilidad
</commit_message>
<xml_diff>
--- a/Documentacion/Matriz de Trazabilidad.docx
+++ b/Documentacion/Matriz de Trazabilidad.docx
@@ -388,7 +388,7 @@
                 <w:sz w:val="22"/>
                 <w:szCs w:val="22"/>
               </w:rPr>
-              <w:t>Sin iniciar</w:t>
+              <w:t>Completado</w:t>
             </w:r>
           </w:p>
         </w:tc>
@@ -522,7 +522,7 @@
                 <w:sz w:val="22"/>
                 <w:szCs w:val="22"/>
               </w:rPr>
-              <w:t>Sin iniciar</w:t>
+              <w:t>En proceso</w:t>
             </w:r>
           </w:p>
         </w:tc>
@@ -1966,7 +1966,7 @@
                 <w:sz w:val="22"/>
                 <w:szCs w:val="22"/>
               </w:rPr>
-              <w:t>Sin iniciar</w:t>
+              <w:t>Completado</w:t>
             </w:r>
           </w:p>
         </w:tc>
@@ -2073,7 +2073,7 @@
                 <w:sz w:val="22"/>
                 <w:szCs w:val="22"/>
               </w:rPr>
-              <w:t>Sin iniciar</w:t>
+              <w:t>En proceso</w:t>
             </w:r>
           </w:p>
         </w:tc>
@@ -2828,7 +2828,7 @@
                 <w:sz w:val="22"/>
                 <w:szCs w:val="22"/>
               </w:rPr>
-              <w:t>Sin iniciar</w:t>
+              <w:t>Completado</w:t>
             </w:r>
           </w:p>
         </w:tc>
@@ -2962,7 +2962,7 @@
                 <w:sz w:val="22"/>
                 <w:szCs w:val="22"/>
               </w:rPr>
-              <w:t>Sin iniciar</w:t>
+              <w:t>En proceso</w:t>
             </w:r>
           </w:p>
         </w:tc>
@@ -4748,6 +4748,7 @@
   <w:style w:type="character" w:default="1" w:styleId="Fuentedeprrafopredeter">
     <w:name w:val="Default Paragraph Font"/>
     <w:uiPriority w:val="1"/>
+    <w:semiHidden/>
     <w:unhideWhenUsed/>
   </w:style>
   <w:style w:type="table" w:default="1" w:styleId="Tablanormal">

</xml_diff>

<commit_message>
Update Modelos y Matriz de Trazabilidad
Se agregan algunos modelos físicos
</commit_message>
<xml_diff>
--- a/Documentacion/Matriz de Trazabilidad.docx
+++ b/Documentacion/Matriz de Trazabilidad.docx
@@ -370,6 +370,7 @@
               <w:bottom w:val="single" w:sz="6" w:space="0" w:color="C4C7C5"/>
               <w:right w:val="single" w:sz="6" w:space="0" w:color="C4C7C5"/>
             </w:tcBorders>
+            <w:shd w:val="clear" w:color="auto" w:fill="00B050"/>
             <w:vAlign w:val="center"/>
           </w:tcPr>
           <w:p>
@@ -504,6 +505,7 @@
               <w:bottom w:val="single" w:sz="6" w:space="0" w:color="C4C7C5"/>
               <w:right w:val="single" w:sz="6" w:space="0" w:color="C4C7C5"/>
             </w:tcBorders>
+            <w:shd w:val="clear" w:color="auto" w:fill="00B050"/>
             <w:vAlign w:val="center"/>
           </w:tcPr>
           <w:p>
@@ -638,6 +640,7 @@
               <w:bottom w:val="single" w:sz="6" w:space="0" w:color="C4C7C5"/>
               <w:right w:val="single" w:sz="6" w:space="0" w:color="C4C7C5"/>
             </w:tcBorders>
+            <w:shd w:val="clear" w:color="auto" w:fill="00B050"/>
             <w:vAlign w:val="center"/>
           </w:tcPr>
           <w:p>
@@ -656,7 +659,7 @@
                 <w:sz w:val="22"/>
                 <w:szCs w:val="22"/>
               </w:rPr>
-              <w:t>En proceso</w:t>
+              <w:t>Completado</w:t>
             </w:r>
           </w:p>
         </w:tc>
@@ -772,6 +775,7 @@
               <w:bottom w:val="single" w:sz="6" w:space="0" w:color="C4C7C5"/>
               <w:right w:val="single" w:sz="6" w:space="0" w:color="C4C7C5"/>
             </w:tcBorders>
+            <w:shd w:val="clear" w:color="auto" w:fill="FFFF00"/>
             <w:vAlign w:val="center"/>
           </w:tcPr>
           <w:p>
@@ -790,7 +794,7 @@
                 <w:sz w:val="22"/>
                 <w:szCs w:val="22"/>
               </w:rPr>
-              <w:t>Sin iniciar</w:t>
+              <w:t>En proceso</w:t>
             </w:r>
           </w:p>
         </w:tc>
@@ -948,6 +952,8 @@
               <w:bottom w:val="single" w:sz="6" w:space="0" w:color="C4C7C5"/>
               <w:right w:val="single" w:sz="6" w:space="0" w:color="C4C7C5"/>
             </w:tcBorders>
+            <w:shd w:val="clear" w:color="auto" w:fill="00B050"/>
+            <w:vAlign w:val="center"/>
           </w:tcPr>
           <w:p>
             <w:pPr>
@@ -1099,6 +1105,8 @@
               <w:bottom w:val="single" w:sz="6" w:space="0" w:color="C4C7C5"/>
               <w:right w:val="single" w:sz="6" w:space="0" w:color="C4C7C5"/>
             </w:tcBorders>
+            <w:shd w:val="clear" w:color="auto" w:fill="00B050"/>
+            <w:vAlign w:val="center"/>
           </w:tcPr>
           <w:p>
             <w:pPr>
@@ -1232,6 +1240,7 @@
               <w:bottom w:val="single" w:sz="6" w:space="0" w:color="C4C7C5"/>
               <w:right w:val="single" w:sz="6" w:space="0" w:color="C4C7C5"/>
             </w:tcBorders>
+            <w:shd w:val="clear" w:color="auto" w:fill="00B050"/>
             <w:vAlign w:val="center"/>
           </w:tcPr>
           <w:p>
@@ -1250,7 +1259,7 @@
                 <w:sz w:val="22"/>
                 <w:szCs w:val="22"/>
               </w:rPr>
-              <w:t>Sin iniciar</w:t>
+              <w:t>Completado</w:t>
             </w:r>
           </w:p>
         </w:tc>
@@ -1366,6 +1375,7 @@
               <w:bottom w:val="single" w:sz="6" w:space="0" w:color="C4C7C5"/>
               <w:right w:val="single" w:sz="6" w:space="0" w:color="C4C7C5"/>
             </w:tcBorders>
+            <w:shd w:val="clear" w:color="auto" w:fill="EE0000"/>
             <w:vAlign w:val="center"/>
           </w:tcPr>
           <w:p>
@@ -1524,6 +1534,7 @@
               <w:bottom w:val="single" w:sz="6" w:space="0" w:color="C4C7C5"/>
               <w:right w:val="single" w:sz="6" w:space="0" w:color="C4C7C5"/>
             </w:tcBorders>
+            <w:shd w:val="clear" w:color="auto" w:fill="EE0000"/>
             <w:vAlign w:val="center"/>
           </w:tcPr>
           <w:p>
@@ -1658,6 +1669,7 @@
               <w:bottom w:val="single" w:sz="6" w:space="0" w:color="C4C7C5"/>
               <w:right w:val="single" w:sz="6" w:space="0" w:color="C4C7C5"/>
             </w:tcBorders>
+            <w:shd w:val="clear" w:color="auto" w:fill="EE0000"/>
             <w:vAlign w:val="center"/>
           </w:tcPr>
           <w:p>
@@ -1950,6 +1962,7 @@
         <w:tc>
           <w:tcPr>
             <w:tcW w:w="1558" w:type="dxa"/>
+            <w:shd w:val="clear" w:color="auto" w:fill="FFFF00"/>
             <w:vAlign w:val="center"/>
           </w:tcPr>
           <w:p>
@@ -2057,6 +2070,7 @@
         <w:tc>
           <w:tcPr>
             <w:tcW w:w="1558" w:type="dxa"/>
+            <w:shd w:val="clear" w:color="auto" w:fill="EE0000"/>
             <w:vAlign w:val="center"/>
           </w:tcPr>
           <w:p>
@@ -2164,6 +2178,7 @@
         <w:tc>
           <w:tcPr>
             <w:tcW w:w="1558" w:type="dxa"/>
+            <w:shd w:val="clear" w:color="auto" w:fill="EE0000"/>
             <w:vAlign w:val="center"/>
           </w:tcPr>
           <w:p>
@@ -2251,6 +2266,7 @@
         <w:tc>
           <w:tcPr>
             <w:tcW w:w="1558" w:type="dxa"/>
+            <w:shd w:val="clear" w:color="auto" w:fill="EE0000"/>
             <w:vAlign w:val="center"/>
           </w:tcPr>
           <w:p>
@@ -2346,6 +2362,7 @@
         <w:tc>
           <w:tcPr>
             <w:tcW w:w="1558" w:type="dxa"/>
+            <w:shd w:val="clear" w:color="auto" w:fill="EE0000"/>
             <w:vAlign w:val="center"/>
           </w:tcPr>
           <w:p>
@@ -2433,6 +2450,7 @@
         <w:tc>
           <w:tcPr>
             <w:tcW w:w="1558" w:type="dxa"/>
+            <w:shd w:val="clear" w:color="auto" w:fill="EE0000"/>
             <w:vAlign w:val="center"/>
           </w:tcPr>
           <w:p>
@@ -2810,6 +2828,7 @@
               <w:bottom w:val="single" w:sz="6" w:space="0" w:color="C4C7C5"/>
               <w:right w:val="single" w:sz="6" w:space="0" w:color="C4C7C5"/>
             </w:tcBorders>
+            <w:shd w:val="clear" w:color="auto" w:fill="00B050"/>
             <w:vAlign w:val="center"/>
           </w:tcPr>
           <w:p>
@@ -2944,6 +2963,7 @@
               <w:bottom w:val="single" w:sz="6" w:space="0" w:color="C4C7C5"/>
               <w:right w:val="single" w:sz="6" w:space="0" w:color="C4C7C5"/>
             </w:tcBorders>
+            <w:shd w:val="clear" w:color="auto" w:fill="00B050"/>
             <w:vAlign w:val="center"/>
           </w:tcPr>
           <w:p>
@@ -3078,6 +3098,7 @@
               <w:bottom w:val="single" w:sz="6" w:space="0" w:color="C4C7C5"/>
               <w:right w:val="single" w:sz="6" w:space="0" w:color="C4C7C5"/>
             </w:tcBorders>
+            <w:shd w:val="clear" w:color="auto" w:fill="00B050"/>
             <w:vAlign w:val="center"/>
           </w:tcPr>
           <w:p>
@@ -3096,7 +3117,7 @@
                 <w:sz w:val="22"/>
                 <w:szCs w:val="22"/>
               </w:rPr>
-              <w:t>En proceso</w:t>
+              <w:t>Completado</w:t>
             </w:r>
           </w:p>
         </w:tc>
@@ -3212,6 +3233,7 @@
               <w:bottom w:val="single" w:sz="6" w:space="0" w:color="C4C7C5"/>
               <w:right w:val="single" w:sz="6" w:space="0" w:color="C4C7C5"/>
             </w:tcBorders>
+            <w:shd w:val="clear" w:color="auto" w:fill="FFFF00"/>
             <w:vAlign w:val="center"/>
           </w:tcPr>
           <w:p>
@@ -3230,7 +3252,7 @@
                 <w:sz w:val="22"/>
                 <w:szCs w:val="22"/>
               </w:rPr>
-              <w:t>Sin iniciar</w:t>
+              <w:t>En proceso</w:t>
             </w:r>
           </w:p>
         </w:tc>
@@ -3370,6 +3392,7 @@
               <w:bottom w:val="single" w:sz="6" w:space="0" w:color="C4C7C5"/>
               <w:right w:val="single" w:sz="6" w:space="0" w:color="C4C7C5"/>
             </w:tcBorders>
+            <w:shd w:val="clear" w:color="auto" w:fill="EE0000"/>
             <w:vAlign w:val="center"/>
           </w:tcPr>
           <w:p>
@@ -3504,6 +3527,7 @@
               <w:bottom w:val="single" w:sz="6" w:space="0" w:color="C4C7C5"/>
               <w:right w:val="single" w:sz="6" w:space="0" w:color="C4C7C5"/>
             </w:tcBorders>
+            <w:shd w:val="clear" w:color="auto" w:fill="EE0000"/>
             <w:vAlign w:val="center"/>
           </w:tcPr>
           <w:p>
@@ -3662,6 +3686,7 @@
               <w:bottom w:val="single" w:sz="6" w:space="0" w:color="C4C7C5"/>
               <w:right w:val="single" w:sz="6" w:space="0" w:color="C4C7C5"/>
             </w:tcBorders>
+            <w:shd w:val="clear" w:color="auto" w:fill="EE0000"/>
             <w:vAlign w:val="center"/>
           </w:tcPr>
           <w:p>
@@ -3793,6 +3818,7 @@
               <w:bottom w:val="single" w:sz="6" w:space="0" w:color="C4C7C5"/>
               <w:right w:val="single" w:sz="6" w:space="0" w:color="C4C7C5"/>
             </w:tcBorders>
+            <w:shd w:val="clear" w:color="auto" w:fill="EE0000"/>
             <w:vAlign w:val="center"/>
           </w:tcPr>
           <w:p>

</xml_diff>

<commit_message>
Update Matriz de Trazabilidad.docx
Se acaba el RF-16 y queda faltando solo el ultimo requisito funcional del modulo tareas
</commit_message>
<xml_diff>
--- a/Documentacion/Matriz de Trazabilidad.docx
+++ b/Documentacion/Matriz de Trazabilidad.docx
@@ -3234,7 +3234,7 @@
               <w:bottom w:val="single" w:sz="6" w:space="0" w:color="C4C7C5"/>
               <w:right w:val="single" w:sz="6" w:space="0" w:color="C4C7C5"/>
             </w:tcBorders>
-            <w:shd w:val="clear" w:color="auto" w:fill="FFFF00"/>
+            <w:shd w:val="clear" w:color="auto" w:fill="00B050"/>
             <w:vAlign w:val="center"/>
           </w:tcPr>
           <w:p>
@@ -3253,7 +3253,7 @@
                 <w:sz w:val="22"/>
                 <w:szCs w:val="22"/>
               </w:rPr>
-              <w:t>En proceso</w:t>
+              <w:t>Completado</w:t>
             </w:r>
           </w:p>
         </w:tc>
@@ -3393,7 +3393,7 @@
               <w:bottom w:val="single" w:sz="6" w:space="0" w:color="C4C7C5"/>
               <w:right w:val="single" w:sz="6" w:space="0" w:color="C4C7C5"/>
             </w:tcBorders>
-            <w:shd w:val="clear" w:color="auto" w:fill="EE0000"/>
+            <w:shd w:val="clear" w:color="auto" w:fill="00B050"/>
             <w:vAlign w:val="center"/>
           </w:tcPr>
           <w:p>
@@ -3412,7 +3412,7 @@
                 <w:sz w:val="22"/>
                 <w:szCs w:val="22"/>
               </w:rPr>
-              <w:t>Sin iniciar</w:t>
+              <w:t>Completado</w:t>
             </w:r>
           </w:p>
         </w:tc>
@@ -3528,7 +3528,7 @@
               <w:bottom w:val="single" w:sz="6" w:space="0" w:color="C4C7C5"/>
               <w:right w:val="single" w:sz="6" w:space="0" w:color="C4C7C5"/>
             </w:tcBorders>
-            <w:shd w:val="clear" w:color="auto" w:fill="EE0000"/>
+            <w:shd w:val="clear" w:color="auto" w:fill="00B050"/>
             <w:vAlign w:val="center"/>
           </w:tcPr>
           <w:p>
@@ -3547,7 +3547,7 @@
                 <w:sz w:val="22"/>
                 <w:szCs w:val="22"/>
               </w:rPr>
-              <w:t>Sin iniciar</w:t>
+              <w:t>Completado</w:t>
             </w:r>
           </w:p>
         </w:tc>

</xml_diff>